<commit_message>
Added research paper summary
</commit_message>
<xml_diff>
--- a/research_and_thesis_writing/research_paper_summary.docx
+++ b/research_and_thesis_writing/research_paper_summary.docx
@@ -9,7 +9,6 @@
           <w:bCs/>
           <w:sz w:val="28"/>
           <w:szCs w:val="28"/>
-          <w:lang w:val="en-PK"/>
         </w:rPr>
       </w:pPr>
       <w:r>
@@ -18,21 +17,12 @@
           <w:bCs/>
           <w:sz w:val="28"/>
           <w:szCs w:val="28"/>
-          <w:lang w:val="en-PK"/>
         </w:rPr>
         <w:t>I. Direct Application &amp; Geographical Context (Sindh &amp; Desertification Focus)</w:t>
       </w:r>
     </w:p>
     <w:p>
-      <w:pPr>
-        <w:rPr>
-          <w:lang w:val="en-PK"/>
-        </w:rPr>
-      </w:pPr>
-      <w:r>
-        <w:rPr>
-          <w:lang w:val="en-PK"/>
-        </w:rPr>
+      <w:r>
         <w:t>These papers are essential for framing your study area, defining the environmental threats, and establishing the target variables.</w:t>
       </w:r>
     </w:p>
@@ -42,38 +32,33 @@
           <w:ilvl w:val="0"/>
           <w:numId w:val="1"/>
         </w:numPr>
-        <w:rPr>
-          <w:lang w:val="en-PK"/>
-        </w:rPr>
-      </w:pPr>
-      <w:r>
-        <w:rPr>
-          <w:b/>
-          <w:bCs/>
-          <w:lang w:val="en-PK"/>
+      </w:pPr>
+      <w:r>
+        <w:rPr>
+          <w:b/>
+          <w:bCs/>
         </w:rPr>
         <w:t>futureinternet-17-00380-v3.pdf</w:t>
       </w:r>
       <w:r>
-        <w:rPr>
-          <w:lang w:val="en-PK"/>
-        </w:rPr>
         <w:t xml:space="preserve">: This paper is highly relevant as it presents an encoder-decoder architecture for time-series desertification forecasting specifically in the </w:t>
       </w:r>
       <w:proofErr w:type="spellStart"/>
       <w:r>
-        <w:rPr>
-          <w:lang w:val="en-PK"/>
-        </w:rPr>
         <w:t>Thatta</w:t>
       </w:r>
       <w:proofErr w:type="spellEnd"/>
       <w:r>
-        <w:rPr>
-          <w:lang w:val="en-PK"/>
-        </w:rPr>
         <w:t xml:space="preserve"> and Badin districts of Sindh, Pakistan. </w:t>
       </w:r>
+      <w:hyperlink r:id="rId5" w:history="1">
+        <w:r>
+          <w:rPr>
+            <w:rStyle w:val="Hyperlink"/>
+          </w:rPr>
+          <w:t>Novel Encoder–Decoder Architecture with Attention Mechanisms for Satellite-Based Environmental Forecasting in Smart City Applications</w:t>
+        </w:r>
+      </w:hyperlink>
     </w:p>
     <w:p>
       <w:pPr>
@@ -81,15 +66,11 @@
           <w:ilvl w:val="0"/>
           <w:numId w:val="1"/>
         </w:numPr>
-        <w:rPr>
-          <w:lang w:val="en-PK"/>
-        </w:rPr>
-      </w:pPr>
-      <w:r>
-        <w:rPr>
-          <w:b/>
-          <w:bCs/>
-          <w:lang w:val="en-PK"/>
+      </w:pPr>
+      <w:r>
+        <w:rPr>
+          <w:b/>
+          <w:bCs/>
         </w:rPr>
         <w:t>IMPORTANT_</w:t>
       </w:r>
@@ -97,16 +78,34 @@
         <w:rPr>
           <w:b/>
           <w:bCs/>
-          <w:lang w:val="en-PK"/>
         </w:rPr>
         <w:t>desertification_risk.pdf</w:t>
       </w:r>
       <w:r>
-        <w:rPr>
-          <w:lang w:val="en-PK"/>
-        </w:rPr>
         <w:t xml:space="preserve">: This study provides a vital spatiotemporal framework that integrates satellite datasets to assess and forecast the Desertification Sensitivity Index (DSI) using deep learning techniques. </w:t>
       </w:r>
+      <w:hyperlink r:id="rId6" w:history="1">
+        <w:r>
+          <w:rPr>
+            <w:rStyle w:val="Hyperlink"/>
+          </w:rPr>
+          <w:t xml:space="preserve">(PDF) </w:t>
+        </w:r>
+        <w:proofErr w:type="spellStart"/>
+        <w:r>
+          <w:rPr>
+            <w:rStyle w:val="Hyperlink"/>
+          </w:rPr>
+          <w:t>PyGEE</w:t>
+        </w:r>
+        <w:proofErr w:type="spellEnd"/>
+        <w:r>
+          <w:rPr>
+            <w:rStyle w:val="Hyperlink"/>
+          </w:rPr>
+          <w:t>-ST-MEDALUS: AI Spatiotemporal Framework Integrating MODIS and Sentinel-1/-2 Data for Desertification Risk Assessment in Northeastern Algeria</w:t>
+        </w:r>
+      </w:hyperlink>
     </w:p>
     <w:p>
       <w:pPr>
@@ -114,38 +113,33 @@
           <w:ilvl w:val="0"/>
           <w:numId w:val="1"/>
         </w:numPr>
-        <w:rPr>
-          <w:lang w:val="en-PK"/>
-        </w:rPr>
-      </w:pPr>
-      <w:r>
-        <w:rPr>
-          <w:b/>
-          <w:bCs/>
-          <w:lang w:val="en-PK"/>
+      </w:pPr>
+      <w:r>
+        <w:rPr>
+          <w:b/>
+          <w:bCs/>
         </w:rPr>
         <w:t>land-13-01080.pdf</w:t>
       </w:r>
       <w:r>
-        <w:rPr>
-          <w:lang w:val="en-PK"/>
-        </w:rPr>
         <w:t xml:space="preserve">: This paper is crucial for establishing the geographical and ecological background, as it </w:t>
       </w:r>
       <w:proofErr w:type="spellStart"/>
       <w:r>
-        <w:rPr>
-          <w:lang w:val="en-PK"/>
-        </w:rPr>
         <w:t>analyzes</w:t>
       </w:r>
       <w:proofErr w:type="spellEnd"/>
       <w:r>
-        <w:rPr>
-          <w:lang w:val="en-PK"/>
-        </w:rPr>
         <w:t xml:space="preserve"> land use and land cover (LULC) changes specifically within the Indus Delta of Sindh Province. </w:t>
       </w:r>
+      <w:hyperlink r:id="rId7" w:history="1">
+        <w:r>
+          <w:rPr>
+            <w:rStyle w:val="Hyperlink"/>
+          </w:rPr>
+          <w:t>Land Use Change Impacts over the Indus Delta: A Case Study of Sindh Province, Pakistan</w:t>
+        </w:r>
+      </w:hyperlink>
     </w:p>
     <w:p>
       <w:pPr>
@@ -153,38 +147,47 @@
           <w:ilvl w:val="0"/>
           <w:numId w:val="1"/>
         </w:numPr>
-        <w:rPr>
-          <w:lang w:val="en-PK"/>
-        </w:rPr>
-      </w:pPr>
-      <w:r>
-        <w:rPr>
-          <w:b/>
-          <w:bCs/>
-          <w:lang w:val="en-PK"/>
+      </w:pPr>
+      <w:r>
+        <w:rPr>
+          <w:b/>
+          <w:bCs/>
         </w:rPr>
         <w:t>Monitoring_the_effects_of_climate_change_and_topog.pdf</w:t>
       </w:r>
       <w:r>
-        <w:rPr>
-          <w:lang w:val="en-PK"/>
-        </w:rPr>
         <w:t xml:space="preserve">: This research evaluates the impacts of climate change and topography on vegetation health in </w:t>
       </w:r>
       <w:proofErr w:type="spellStart"/>
       <w:r>
-        <w:rPr>
-          <w:lang w:val="en-PK"/>
-        </w:rPr>
         <w:t>Tharparkar</w:t>
       </w:r>
       <w:proofErr w:type="spellEnd"/>
       <w:r>
-        <w:rPr>
-          <w:lang w:val="en-PK"/>
-        </w:rPr>
         <w:t xml:space="preserve">, Pakistan, providing critical context for desertification drivers in the region. </w:t>
       </w:r>
+      <w:hyperlink r:id="rId8" w:history="1">
+        <w:r>
+          <w:rPr>
+            <w:rStyle w:val="Hyperlink"/>
+          </w:rPr>
+          <w:t xml:space="preserve">Monitoring the effects of climate change and topography on vegetation health in </w:t>
+        </w:r>
+        <w:proofErr w:type="spellStart"/>
+        <w:r>
+          <w:rPr>
+            <w:rStyle w:val="Hyperlink"/>
+          </w:rPr>
+          <w:t>Tharparkar</w:t>
+        </w:r>
+        <w:proofErr w:type="spellEnd"/>
+        <w:r>
+          <w:rPr>
+            <w:rStyle w:val="Hyperlink"/>
+          </w:rPr>
+          <w:t>, Pakistan | Journal of Water and Climate Change | IWA Publishing</w:t>
+        </w:r>
+      </w:hyperlink>
     </w:p>
     <w:p>
       <w:pPr>
@@ -192,52 +195,69 @@
           <w:ilvl w:val="0"/>
           <w:numId w:val="1"/>
         </w:numPr>
-        <w:rPr>
-          <w:lang w:val="en-PK"/>
-        </w:rPr>
-      </w:pPr>
-      <w:r>
-        <w:rPr>
-          <w:b/>
-          <w:bCs/>
-          <w:lang w:val="en-PK"/>
+      </w:pPr>
+      <w:r>
+        <w:rPr>
+          <w:b/>
+          <w:bCs/>
         </w:rPr>
         <w:t>remotesensing-12-00580.pdf</w:t>
       </w:r>
       <w:r>
-        <w:rPr>
-          <w:lang w:val="en-PK"/>
-        </w:rPr>
         <w:t xml:space="preserve">: This study offers a </w:t>
       </w:r>
       <w:proofErr w:type="spellStart"/>
       <w:r>
-        <w:rPr>
-          <w:lang w:val="en-PK"/>
-        </w:rPr>
         <w:t>spatio</w:t>
       </w:r>
       <w:proofErr w:type="spellEnd"/>
       <w:r>
-        <w:rPr>
-          <w:lang w:val="en-PK"/>
-        </w:rPr>
         <w:t xml:space="preserve">-temporal analysis of rainfall and drought monitoring in the </w:t>
       </w:r>
       <w:proofErr w:type="spellStart"/>
       <w:r>
-        <w:rPr>
-          <w:lang w:val="en-PK"/>
-        </w:rPr>
         <w:t>Tharparkar</w:t>
       </w:r>
       <w:proofErr w:type="spellEnd"/>
       <w:r>
-        <w:rPr>
-          <w:lang w:val="en-PK"/>
-        </w:rPr>
         <w:t xml:space="preserve"> region of Pakistan. It is highly relevant for understanding the climatic conditions that trigger desertification. </w:t>
       </w:r>
+      <w:hyperlink r:id="rId9" w:history="1">
+        <w:r>
+          <w:rPr>
+            <w:rStyle w:val="Hyperlink"/>
+          </w:rPr>
+          <w:t xml:space="preserve">A </w:t>
+        </w:r>
+        <w:proofErr w:type="spellStart"/>
+        <w:r>
+          <w:rPr>
+            <w:rStyle w:val="Hyperlink"/>
+          </w:rPr>
+          <w:t>Spatio</w:t>
+        </w:r>
+        <w:proofErr w:type="spellEnd"/>
+        <w:r>
+          <w:rPr>
+            <w:rStyle w:val="Hyperlink"/>
+          </w:rPr>
+          <w:t xml:space="preserve">-Temporal Analysis of Rainfall and Drought Monitoring in the </w:t>
+        </w:r>
+        <w:proofErr w:type="spellStart"/>
+        <w:r>
+          <w:rPr>
+            <w:rStyle w:val="Hyperlink"/>
+          </w:rPr>
+          <w:t>Tharparkar</w:t>
+        </w:r>
+        <w:proofErr w:type="spellEnd"/>
+        <w:r>
+          <w:rPr>
+            <w:rStyle w:val="Hyperlink"/>
+          </w:rPr>
+          <w:t xml:space="preserve"> Region of Pakistan</w:t>
+        </w:r>
+      </w:hyperlink>
     </w:p>
     <w:p>
       <w:pPr>
@@ -245,24 +265,25 @@
           <w:ilvl w:val="0"/>
           <w:numId w:val="1"/>
         </w:numPr>
-        <w:rPr>
-          <w:lang w:val="en-PK"/>
-        </w:rPr>
-      </w:pPr>
-      <w:r>
-        <w:rPr>
-          <w:b/>
-          <w:bCs/>
-          <w:lang w:val="en-PK"/>
+      </w:pPr>
+      <w:r>
+        <w:rPr>
+          <w:b/>
+          <w:bCs/>
         </w:rPr>
         <w:t>502.pdf</w:t>
       </w:r>
       <w:r>
-        <w:rPr>
-          <w:lang w:val="en-PK"/>
-        </w:rPr>
         <w:t xml:space="preserve">: This paper evaluates coastal vulnerability and ecosystem degradation in the Indus Delta using remote sensing approaches, supporting your localized environmental research. </w:t>
       </w:r>
+      <w:hyperlink r:id="rId10" w:history="1">
+        <w:r>
+          <w:rPr>
+            <w:rStyle w:val="Hyperlink"/>
+          </w:rPr>
+          <w:t>Spatiotemporal Modelling of Coastal Vulnerability and Ecosystem Degradation in Indus Delta: A Landsat and DSAS Approach – DOAJ</w:t>
+        </w:r>
+      </w:hyperlink>
     </w:p>
     <w:p>
       <w:pPr>
@@ -271,7 +292,6 @@
           <w:bCs/>
           <w:sz w:val="28"/>
           <w:szCs w:val="28"/>
-          <w:lang w:val="en-PK"/>
         </w:rPr>
       </w:pPr>
       <w:r>
@@ -280,7 +300,6 @@
           <w:bCs/>
           <w:sz w:val="28"/>
           <w:szCs w:val="28"/>
-          <w:lang w:val="en-PK"/>
         </w:rPr>
         <w:t>II. Methodological Alignment (</w:t>
       </w:r>
@@ -291,7 +310,6 @@
           <w:bCs/>
           <w:sz w:val="28"/>
           <w:szCs w:val="28"/>
-          <w:lang w:val="en-PK"/>
         </w:rPr>
         <w:t>ConvGRU-UNet</w:t>
       </w:r>
@@ -302,35 +320,20 @@
           <w:bCs/>
           <w:sz w:val="28"/>
           <w:szCs w:val="28"/>
-          <w:lang w:val="en-PK"/>
         </w:rPr>
         <w:t xml:space="preserve"> Architecture &amp; Loss Functions)</w:t>
       </w:r>
     </w:p>
     <w:p>
-      <w:pPr>
-        <w:rPr>
-          <w:lang w:val="en-PK"/>
-        </w:rPr>
-      </w:pPr>
-      <w:r>
-        <w:rPr>
-          <w:lang w:val="en-PK"/>
-        </w:rPr>
+      <w:r>
         <w:t xml:space="preserve">These papers provide the mathematical and structural justification for the </w:t>
       </w:r>
       <w:proofErr w:type="spellStart"/>
       <w:r>
-        <w:rPr>
-          <w:lang w:val="en-PK"/>
-        </w:rPr>
         <w:t>ConvGRU-UNet</w:t>
       </w:r>
       <w:proofErr w:type="spellEnd"/>
       <w:r>
-        <w:rPr>
-          <w:lang w:val="en-PK"/>
-        </w:rPr>
         <w:t xml:space="preserve"> Seq2Seq pipeline and the loss functions you implemented in your notebook.</w:t>
       </w:r>
     </w:p>
@@ -340,36 +343,23 @@
           <w:ilvl w:val="0"/>
           <w:numId w:val="2"/>
         </w:numPr>
-        <w:rPr>
-          <w:lang w:val="en-PK"/>
-        </w:rPr>
-      </w:pPr>
-      <w:r>
-        <w:rPr>
-          <w:b/>
-          <w:bCs/>
-          <w:lang w:val="en-PK"/>
+      </w:pPr>
+      <w:r>
+        <w:rPr>
+          <w:b/>
+          <w:bCs/>
         </w:rPr>
         <w:t>Prediction_of_Ionospheric_Scintillation_with_ConvG.pdf</w:t>
       </w:r>
       <w:r>
-        <w:rPr>
-          <w:lang w:val="en-PK"/>
-        </w:rPr>
         <w:t xml:space="preserve">: This paper validates the use of </w:t>
       </w:r>
       <w:proofErr w:type="spellStart"/>
       <w:r>
-        <w:rPr>
-          <w:lang w:val="en-PK"/>
-        </w:rPr>
         <w:t>ConvGRU</w:t>
       </w:r>
       <w:proofErr w:type="spellEnd"/>
       <w:r>
-        <w:rPr>
-          <w:lang w:val="en-PK"/>
-        </w:rPr>
         <w:t xml:space="preserve"> networks for forecasting 2D spatiotemporal maps. Importantly, it explicitly justifies the use of the Huber loss function (</w:t>
       </w:r>
       <m:oMath>
@@ -378,7 +368,6 @@
             <m:ctrlPr>
               <w:rPr>
                 <w:rFonts w:ascii="Cambria Math" w:hAnsi="Cambria Math"/>
-                <w:lang w:val="en-PK"/>
               </w:rPr>
             </m:ctrlPr>
           </m:sSubPr>
@@ -386,7 +375,6 @@
             <m:r>
               <w:rPr>
                 <w:rFonts w:ascii="Cambria Math" w:hAnsi="Cambria Math"/>
-                <w:lang w:val="en-PK"/>
               </w:rPr>
               <m:t>L</m:t>
             </m:r>
@@ -395,7 +383,6 @@
             <m:r>
               <w:rPr>
                 <w:rFonts w:ascii="Cambria Math" w:hAnsi="Cambria Math"/>
-                <w:lang w:val="en-PK"/>
               </w:rPr>
               <m:t>δ</m:t>
             </m:r>
@@ -403,25 +390,37 @@
         </m:sSub>
       </m:oMath>
       <w:r>
-        <w:rPr>
-          <w:lang w:val="en-PK"/>
-        </w:rPr>
-        <w:t xml:space="preserve">) to manage outliers and high-noise levels in ConvGRU predictions. This perfectly supports your decision to use </w:t>
-      </w:r>
-      <w:proofErr w:type="gramStart"/>
-      <w:r>
-        <w:rPr>
-          <w:lang w:val="en-PK"/>
-        </w:rPr>
-        <w:t>F.huber</w:t>
-      </w:r>
-      <w:proofErr w:type="gramEnd"/>
-      <w:r>
-        <w:rPr>
-          <w:lang w:val="en-PK"/>
-        </w:rPr>
-        <w:t xml:space="preserve">_loss for computing the loss on DSI deltas in your training loop. </w:t>
-      </w:r>
+        <w:t xml:space="preserve">) to manage outliers and high-noise levels in ConvGRU predictions. This perfectly supports your decision to use F.huber_loss for computing the loss on DSI deltas in your training loop. </w:t>
+      </w:r>
+      <w:hyperlink r:id="rId11" w:history="1">
+        <w:r>
+          <w:rPr>
+            <w:rStyle w:val="Hyperlink"/>
+          </w:rPr>
+          <w:t xml:space="preserve">Prediction of </w:t>
+        </w:r>
+        <w:r>
+          <w:rPr>
+            <w:rStyle w:val="Hyperlink"/>
+          </w:rPr>
+          <w:lastRenderedPageBreak/>
+          <w:t xml:space="preserve">Ionospheric Scintillation with </w:t>
+        </w:r>
+        <w:proofErr w:type="spellStart"/>
+        <w:r>
+          <w:rPr>
+            <w:rStyle w:val="Hyperlink"/>
+          </w:rPr>
+          <w:t>ConvGRU</w:t>
+        </w:r>
+        <w:proofErr w:type="spellEnd"/>
+        <w:r>
+          <w:rPr>
+            <w:rStyle w:val="Hyperlink"/>
+          </w:rPr>
+          <w:t xml:space="preserve"> Networks Using GNSS Ground-Based Data across South America</w:t>
+        </w:r>
+      </w:hyperlink>
     </w:p>
     <w:p>
       <w:pPr>
@@ -429,80 +428,113 @@
           <w:ilvl w:val="0"/>
           <w:numId w:val="2"/>
         </w:numPr>
-        <w:rPr>
-          <w:lang w:val="en-PK"/>
-        </w:rPr>
-      </w:pPr>
-      <w:r>
-        <w:rPr>
-          <w:b/>
-          <w:bCs/>
-          <w:lang w:val="en-PK"/>
+      </w:pPr>
+      <w:r>
+        <w:rPr>
+          <w:b/>
+          <w:bCs/>
         </w:rPr>
         <w:t>jh2024068.pdf</w:t>
       </w:r>
       <w:r>
-        <w:rPr>
-          <w:lang w:val="en-PK"/>
-        </w:rPr>
         <w:t xml:space="preserve">: This study demonstrates an iterative approach that integrates the temporal dynamics of </w:t>
       </w:r>
       <w:proofErr w:type="spellStart"/>
       <w:r>
-        <w:rPr>
-          <w:lang w:val="en-PK"/>
-        </w:rPr>
         <w:t>ConvGRU</w:t>
       </w:r>
       <w:proofErr w:type="spellEnd"/>
       <w:r>
-        <w:rPr>
-          <w:lang w:val="en-PK"/>
-        </w:rPr>
         <w:t xml:space="preserve"> with a </w:t>
       </w:r>
       <w:proofErr w:type="spellStart"/>
       <w:r>
-        <w:rPr>
-          <w:lang w:val="en-PK"/>
-        </w:rPr>
         <w:t>UNet</w:t>
       </w:r>
       <w:proofErr w:type="spellEnd"/>
       <w:r>
-        <w:rPr>
-          <w:lang w:val="en-PK"/>
-        </w:rPr>
         <w:t>-like structure (</w:t>
       </w:r>
       <w:proofErr w:type="spellStart"/>
       <w:r>
-        <w:rPr>
-          <w:lang w:val="en-PK"/>
-        </w:rPr>
         <w:t>RainNet</w:t>
       </w:r>
       <w:proofErr w:type="spellEnd"/>
       <w:r>
-        <w:rPr>
-          <w:lang w:val="en-PK"/>
-        </w:rPr>
         <w:t xml:space="preserve">) for spatial forecasting. This directly mirrors your hybrid </w:t>
       </w:r>
       <w:proofErr w:type="spellStart"/>
       <w:r>
-        <w:rPr>
-          <w:lang w:val="en-PK"/>
-        </w:rPr>
         <w:t>ConvGRU-UNet</w:t>
       </w:r>
       <w:proofErr w:type="spellEnd"/>
       <w:r>
-        <w:rPr>
-          <w:lang w:val="en-PK"/>
-        </w:rPr>
         <w:t xml:space="preserve"> design. </w:t>
       </w:r>
+      <w:hyperlink r:id="rId12" w:history="1">
+        <w:r>
+          <w:rPr>
+            <w:rStyle w:val="Hyperlink"/>
+          </w:rPr>
+          <w:t>Enhancing severe weather predictions with the I-</w:t>
+        </w:r>
+        <w:proofErr w:type="spellStart"/>
+        <w:r>
+          <w:rPr>
+            <w:rStyle w:val="Hyperlink"/>
+          </w:rPr>
+          <w:t>ConvGRU</w:t>
+        </w:r>
+        <w:proofErr w:type="spellEnd"/>
+        <w:r>
+          <w:rPr>
+            <w:rStyle w:val="Hyperlink"/>
+          </w:rPr>
+          <w:t xml:space="preserve"> model: An iterative approach for radar echo time series through </w:t>
+        </w:r>
+        <w:proofErr w:type="spellStart"/>
+        <w:r>
+          <w:rPr>
+            <w:rStyle w:val="Hyperlink"/>
+          </w:rPr>
+          <w:t>ConvGRU</w:t>
+        </w:r>
+        <w:proofErr w:type="spellEnd"/>
+        <w:r>
+          <w:rPr>
+            <w:rStyle w:val="Hyperlink"/>
+          </w:rPr>
+          <w:t xml:space="preserve"> and </w:t>
+        </w:r>
+        <w:proofErr w:type="spellStart"/>
+        <w:r>
+          <w:rPr>
+            <w:rStyle w:val="Hyperlink"/>
+          </w:rPr>
+          <w:t>RainNet</w:t>
+        </w:r>
+        <w:proofErr w:type="spellEnd"/>
+        <w:r>
+          <w:rPr>
+            <w:rStyle w:val="Hyperlink"/>
+          </w:rPr>
+          <w:t xml:space="preserve"> integration | Journal of </w:t>
+        </w:r>
+        <w:proofErr w:type="spellStart"/>
+        <w:r>
+          <w:rPr>
+            <w:rStyle w:val="Hyperlink"/>
+          </w:rPr>
+          <w:t>Hydroinformatics</w:t>
+        </w:r>
+        <w:proofErr w:type="spellEnd"/>
+        <w:r>
+          <w:rPr>
+            <w:rStyle w:val="Hyperlink"/>
+          </w:rPr>
+          <w:t xml:space="preserve"> | IWA Publishing</w:t>
+        </w:r>
+      </w:hyperlink>
     </w:p>
     <w:p>
       <w:pPr>
@@ -510,38 +542,55 @@
           <w:ilvl w:val="0"/>
           <w:numId w:val="2"/>
         </w:numPr>
-        <w:rPr>
-          <w:lang w:val="en-PK"/>
-        </w:rPr>
-      </w:pPr>
-      <w:r>
-        <w:rPr>
-          <w:b/>
-          <w:bCs/>
-          <w:lang w:val="en-PK"/>
+      </w:pPr>
+      <w:r>
+        <w:rPr>
+          <w:b/>
+          <w:bCs/>
         </w:rPr>
         <w:t>3725949.3725957.pdf</w:t>
       </w:r>
       <w:r>
-        <w:rPr>
-          <w:lang w:val="en-PK"/>
-        </w:rPr>
         <w:t xml:space="preserve">: This research utilizes a </w:t>
       </w:r>
       <w:proofErr w:type="spellStart"/>
       <w:r>
-        <w:rPr>
-          <w:lang w:val="en-PK"/>
-        </w:rPr>
         <w:t>ConvGRU</w:t>
       </w:r>
       <w:proofErr w:type="spellEnd"/>
       <w:r>
-        <w:rPr>
-          <w:lang w:val="en-PK"/>
-        </w:rPr>
         <w:t xml:space="preserve"> framework that incorporates skip-connections to handle feature fusion across different layers. This mathematically justifies the spatial recovery mechanisms employed in your CNN Decoder. </w:t>
       </w:r>
+      <w:hyperlink r:id="rId13" w:history="1">
+        <w:proofErr w:type="spellStart"/>
+        <w:r>
+          <w:rPr>
+            <w:rStyle w:val="Hyperlink"/>
+          </w:rPr>
+          <w:t>CGSCNet</w:t>
+        </w:r>
+        <w:proofErr w:type="spellEnd"/>
+        <w:r>
+          <w:rPr>
+            <w:rStyle w:val="Hyperlink"/>
+          </w:rPr>
+          <w:t xml:space="preserve">: </w:t>
+        </w:r>
+        <w:proofErr w:type="spellStart"/>
+        <w:r>
+          <w:rPr>
+            <w:rStyle w:val="Hyperlink"/>
+          </w:rPr>
+          <w:t>ConvGRU</w:t>
+        </w:r>
+        <w:proofErr w:type="spellEnd"/>
+        <w:r>
+          <w:rPr>
+            <w:rStyle w:val="Hyperlink"/>
+          </w:rPr>
+          <w:t xml:space="preserve"> Based Skip-connection Framework for Hyperspectral Image Super-Resolution | Proceedings of the 2024 7th International Conference on Sensors, Signal and Image Processing</w:t>
+        </w:r>
+      </w:hyperlink>
     </w:p>
     <w:p>
       <w:pPr>
@@ -549,15 +598,11 @@
           <w:ilvl w:val="0"/>
           <w:numId w:val="2"/>
         </w:numPr>
-        <w:rPr>
-          <w:lang w:val="en-PK"/>
-        </w:rPr>
-      </w:pPr>
-      <w:r>
-        <w:rPr>
-          <w:b/>
-          <w:bCs/>
-          <w:lang w:val="en-PK"/>
+      </w:pPr>
+      <w:r>
+        <w:rPr>
+          <w:b/>
+          <w:bCs/>
         </w:rPr>
         <w:t>IMPORTANT_</w:t>
       </w:r>
@@ -565,37 +610,42 @@
         <w:rPr>
           <w:b/>
           <w:bCs/>
-          <w:lang w:val="en-PK"/>
         </w:rPr>
         <w:t>remotesensing-17-02679.pdf</w:t>
       </w:r>
       <w:r>
-        <w:rPr>
-          <w:lang w:val="en-PK"/>
-        </w:rPr>
         <w:t xml:space="preserve">: This paper introduces a framework for the </w:t>
       </w:r>
       <w:proofErr w:type="spellStart"/>
       <w:r>
-        <w:rPr>
-          <w:lang w:val="en-PK"/>
-        </w:rPr>
         <w:t>spatio</w:t>
       </w:r>
       <w:proofErr w:type="spellEnd"/>
       <w:r>
-        <w:rPr>
-          <w:lang w:val="en-PK"/>
-        </w:rPr>
-        <w:t xml:space="preserve">-temporal prediction of ocean elements using a Seq2Seq architecture combined </w:t>
-      </w:r>
-      <w:r>
-        <w:rPr>
-          <w:lang w:val="en-PK"/>
-        </w:rPr>
-        <w:lastRenderedPageBreak/>
-        <w:t xml:space="preserve">with a multi-step rolling strategy. This parallels your approach of using an autoregressive decoder to unroll 12 future steps. </w:t>
-      </w:r>
+        <w:t xml:space="preserve">-temporal prediction of ocean elements using a Seq2Seq architecture combined with a multi-step rolling strategy. This parallels your approach of using an autoregressive decoder to unroll 12 future steps. </w:t>
+      </w:r>
+      <w:hyperlink r:id="rId14" w:history="1">
+        <w:r>
+          <w:rPr>
+            <w:rStyle w:val="Hyperlink"/>
+          </w:rPr>
+          <w:t>OKG-</w:t>
+        </w:r>
+        <w:proofErr w:type="spellStart"/>
+        <w:r>
+          <w:rPr>
+            <w:rStyle w:val="Hyperlink"/>
+          </w:rPr>
+          <w:t>ConvGRU</w:t>
+        </w:r>
+        <w:proofErr w:type="spellEnd"/>
+        <w:r>
+          <w:rPr>
+            <w:rStyle w:val="Hyperlink"/>
+          </w:rPr>
+          <w:t>: A Domain Knowledge-Guided Remote Sensing Prediction Framework for Ocean Elements</w:t>
+        </w:r>
+      </w:hyperlink>
     </w:p>
     <w:p>
       <w:pPr>
@@ -603,38 +653,47 @@
           <w:ilvl w:val="0"/>
           <w:numId w:val="2"/>
         </w:numPr>
-        <w:rPr>
-          <w:lang w:val="en-PK"/>
-        </w:rPr>
-      </w:pPr>
-      <w:r>
-        <w:rPr>
-          <w:b/>
-          <w:bCs/>
-          <w:lang w:val="en-PK"/>
+      </w:pPr>
+      <w:r>
+        <w:rPr>
+          <w:b/>
+          <w:bCs/>
         </w:rPr>
         <w:t>Forecast_of_Ionospheric_TEC_Maps_Using_ConvGRU_Deep_Learning_Over_China.pdf</w:t>
       </w:r>
       <w:r>
-        <w:rPr>
-          <w:lang w:val="en-PK"/>
-        </w:rPr>
         <w:t xml:space="preserve">: This paper demonstrates that </w:t>
       </w:r>
       <w:proofErr w:type="spellStart"/>
       <w:r>
-        <w:rPr>
-          <w:lang w:val="en-PK"/>
-        </w:rPr>
         <w:t>ConvGRU</w:t>
       </w:r>
       <w:proofErr w:type="spellEnd"/>
       <w:r>
-        <w:rPr>
-          <w:lang w:val="en-PK"/>
-        </w:rPr>
         <w:t xml:space="preserve"> outperforms standard LSTMs when predicting 2D spatial maps over time. </w:t>
       </w:r>
+      <w:hyperlink r:id="rId15" w:history="1">
+        <w:r>
+          <w:rPr>
+            <w:rStyle w:val="Hyperlink"/>
+          </w:rPr>
+          <w:t xml:space="preserve">Forecast of Ionospheric TEC Maps Using </w:t>
+        </w:r>
+        <w:proofErr w:type="spellStart"/>
+        <w:r>
+          <w:rPr>
+            <w:rStyle w:val="Hyperlink"/>
+          </w:rPr>
+          <w:t>ConvGRU</w:t>
+        </w:r>
+        <w:proofErr w:type="spellEnd"/>
+        <w:r>
+          <w:rPr>
+            <w:rStyle w:val="Hyperlink"/>
+          </w:rPr>
+          <w:t xml:space="preserve"> Deep Learning Over China | IEEE Journals &amp; Magazine | IEEE Xplore</w:t>
+        </w:r>
+      </w:hyperlink>
     </w:p>
     <w:p>
       <w:pPr>
@@ -642,15 +701,11 @@
           <w:ilvl w:val="0"/>
           <w:numId w:val="2"/>
         </w:numPr>
-        <w:rPr>
-          <w:lang w:val="en-PK"/>
-        </w:rPr>
-      </w:pPr>
-      <w:r>
-        <w:rPr>
-          <w:b/>
-          <w:bCs/>
-          <w:lang w:val="en-PK"/>
+      </w:pPr>
+      <w:r>
+        <w:rPr>
+          <w:b/>
+          <w:bCs/>
         </w:rPr>
         <w:t>IMPORTANT_</w:t>
       </w:r>
@@ -658,30 +713,42 @@
         <w:rPr>
           <w:b/>
           <w:bCs/>
-          <w:lang w:val="en-PK"/>
         </w:rPr>
         <w:t>2008.07819v1.pdf</w:t>
       </w:r>
       <w:r>
-        <w:rPr>
-          <w:lang w:val="en-PK"/>
-        </w:rPr>
         <w:t xml:space="preserve">: This paper details the foundational mathematical principles and the specific gate structures (reset and update gates) of the </w:t>
       </w:r>
       <w:proofErr w:type="spellStart"/>
       <w:r>
-        <w:rPr>
-          <w:lang w:val="en-PK"/>
-        </w:rPr>
         <w:t>ConvGRU</w:t>
       </w:r>
       <w:proofErr w:type="spellEnd"/>
       <w:r>
-        <w:rPr>
-          <w:lang w:val="en-PK"/>
-        </w:rPr>
         <w:t xml:space="preserve"> architecture. </w:t>
       </w:r>
+      <w:hyperlink r:id="rId16" w:history="1">
+        <w:r>
+          <w:rPr>
+            <w:rStyle w:val="Hyperlink"/>
+          </w:rPr>
+          <w:t xml:space="preserve">[2008.07819] </w:t>
+        </w:r>
+        <w:proofErr w:type="spellStart"/>
+        <w:r>
+          <w:rPr>
+            <w:rStyle w:val="Hyperlink"/>
+          </w:rPr>
+          <w:t>ConvGRU</w:t>
+        </w:r>
+        <w:proofErr w:type="spellEnd"/>
+        <w:r>
+          <w:rPr>
+            <w:rStyle w:val="Hyperlink"/>
+          </w:rPr>
+          <w:t xml:space="preserve"> in Fine-grained Pitching Action Recognition for Action Outcome Prediction</w:t>
+        </w:r>
+      </w:hyperlink>
     </w:p>
     <w:p>
       <w:pPr>
@@ -690,7 +757,6 @@
           <w:bCs/>
           <w:sz w:val="28"/>
           <w:szCs w:val="28"/>
-          <w:lang w:val="en-PK"/>
         </w:rPr>
       </w:pPr>
       <w:r>
@@ -699,7 +765,6 @@
           <w:bCs/>
           <w:sz w:val="28"/>
           <w:szCs w:val="28"/>
-          <w:lang w:val="en-PK"/>
         </w:rPr>
         <w:t xml:space="preserve">III. Architectural Comparison &amp; Failed </w:t>
       </w:r>
@@ -710,7 +775,6 @@
           <w:bCs/>
           <w:sz w:val="28"/>
           <w:szCs w:val="28"/>
-          <w:lang w:val="en-PK"/>
         </w:rPr>
         <w:t>ConvMamba</w:t>
       </w:r>
@@ -721,49 +785,28 @@
           <w:bCs/>
           <w:sz w:val="28"/>
           <w:szCs w:val="28"/>
-          <w:lang w:val="en-PK"/>
         </w:rPr>
         <w:t xml:space="preserve"> Justification</w:t>
       </w:r>
     </w:p>
     <w:p>
-      <w:pPr>
-        <w:rPr>
-          <w:lang w:val="en-PK"/>
-        </w:rPr>
-      </w:pPr>
-      <w:r>
-        <w:rPr>
-          <w:lang w:val="en-PK"/>
-        </w:rPr>
+      <w:r>
         <w:t xml:space="preserve">These papers are highly valuable for a "Model Selection and Iteration" section, allowing you to rigorously justify why </w:t>
       </w:r>
       <w:proofErr w:type="spellStart"/>
       <w:r>
-        <w:rPr>
-          <w:lang w:val="en-PK"/>
-        </w:rPr>
         <w:t>ConvGRU</w:t>
       </w:r>
       <w:proofErr w:type="spellEnd"/>
       <w:r>
-        <w:rPr>
-          <w:lang w:val="en-PK"/>
-        </w:rPr>
         <w:t xml:space="preserve"> succeeded where your </w:t>
       </w:r>
       <w:proofErr w:type="spellStart"/>
       <w:r>
-        <w:rPr>
-          <w:lang w:val="en-PK"/>
-        </w:rPr>
         <w:t>ConvMamba</w:t>
       </w:r>
       <w:proofErr w:type="spellEnd"/>
       <w:r>
-        <w:rPr>
-          <w:lang w:val="en-PK"/>
-        </w:rPr>
         <w:t xml:space="preserve"> implementation failed.</w:t>
       </w:r>
     </w:p>
@@ -773,66 +816,49 @@
           <w:ilvl w:val="0"/>
           <w:numId w:val="3"/>
         </w:numPr>
-        <w:rPr>
-          <w:lang w:val="en-PK"/>
-        </w:rPr>
-      </w:pPr>
-      <w:r>
-        <w:rPr>
-          <w:b/>
-          <w:bCs/>
-          <w:lang w:val="en-PK"/>
+      </w:pPr>
+      <w:r>
+        <w:rPr>
+          <w:b/>
+          <w:bCs/>
         </w:rPr>
         <w:t>remotesensing-18-00243-v2.pdf</w:t>
       </w:r>
       <w:r>
-        <w:rPr>
-          <w:lang w:val="en-PK"/>
-        </w:rPr>
         <w:t xml:space="preserve">: This comprehensive survey of Mamba in remote sensing highlights the "Topological Mismatch Between 1D Priors and 2D EO Data". It explains that flattening 2D spatial grids into 1D sequences for State Space Models (SSMs) distorts </w:t>
       </w:r>
       <w:proofErr w:type="spellStart"/>
       <w:r>
-        <w:rPr>
-          <w:lang w:val="en-PK"/>
-        </w:rPr>
         <w:t>neighborhood</w:t>
       </w:r>
       <w:proofErr w:type="spellEnd"/>
       <w:r>
-        <w:rPr>
-          <w:lang w:val="en-PK"/>
-        </w:rPr>
         <w:t xml:space="preserve"> relations and complicates state updates. You can use this to explain why managing these 1D states across complex 2D spatial features caused memory and state retention issues in your </w:t>
       </w:r>
       <w:proofErr w:type="spellStart"/>
       <w:r>
-        <w:rPr>
-          <w:lang w:val="en-PK"/>
-        </w:rPr>
         <w:t>ConvMamba</w:t>
       </w:r>
       <w:proofErr w:type="spellEnd"/>
       <w:r>
-        <w:rPr>
-          <w:lang w:val="en-PK"/>
-        </w:rPr>
         <w:t xml:space="preserve"> attempt, making the explicit spatial gating of </w:t>
       </w:r>
       <w:proofErr w:type="spellStart"/>
       <w:r>
-        <w:rPr>
-          <w:lang w:val="en-PK"/>
-        </w:rPr>
         <w:t>ConvGRU</w:t>
       </w:r>
       <w:proofErr w:type="spellEnd"/>
       <w:r>
-        <w:rPr>
-          <w:lang w:val="en-PK"/>
-        </w:rPr>
         <w:t xml:space="preserve"> a more stable choice. </w:t>
       </w:r>
+      <w:hyperlink r:id="rId17" w:history="1">
+        <w:r>
+          <w:rPr>
+            <w:rStyle w:val="Hyperlink"/>
+          </w:rPr>
+          <w:t>Mamba for Remote Sensing: Architectures, Hybrid Paradigms, and Future Directions</w:t>
+        </w:r>
+      </w:hyperlink>
     </w:p>
     <w:p>
       <w:pPr>
@@ -840,66 +866,61 @@
           <w:ilvl w:val="0"/>
           <w:numId w:val="3"/>
         </w:numPr>
-        <w:rPr>
-          <w:lang w:val="en-PK"/>
-        </w:rPr>
-      </w:pPr>
-      <w:r>
-        <w:rPr>
-          <w:b/>
-          <w:bCs/>
-          <w:lang w:val="en-PK"/>
+      </w:pPr>
+      <w:r>
+        <w:rPr>
+          <w:b/>
+          <w:bCs/>
         </w:rPr>
         <w:t>2406.04207v2.pdf</w:t>
       </w:r>
       <w:r>
-        <w:rPr>
-          <w:lang w:val="en-PK"/>
-        </w:rPr>
         <w:t>: This paper introduces "</w:t>
       </w:r>
       <w:proofErr w:type="spellStart"/>
       <w:r>
-        <w:rPr>
-          <w:lang w:val="en-PK"/>
-        </w:rPr>
         <w:t>CDMamba</w:t>
       </w:r>
       <w:proofErr w:type="spellEnd"/>
       <w:r>
-        <w:rPr>
-          <w:lang w:val="en-PK"/>
-        </w:rPr>
         <w:t xml:space="preserve">" to successfully perform remote sensing image change detection. You can contrast their bi-temporal (two-image) change detection task with your continuous 12-step autoregressive forecasting task. This contrast demonstrates that while </w:t>
       </w:r>
       <w:proofErr w:type="spellStart"/>
       <w:r>
-        <w:rPr>
-          <w:lang w:val="en-PK"/>
-        </w:rPr>
         <w:t>ConvMamba</w:t>
       </w:r>
       <w:proofErr w:type="spellEnd"/>
       <w:r>
-        <w:rPr>
-          <w:lang w:val="en-PK"/>
-        </w:rPr>
-        <w:t xml:space="preserve"> can work for comparing two static points in time, unrolling it across many future steps creates state-management bottlenecks that your </w:t>
+        <w:t xml:space="preserve"> can work for comparing two static points </w:t>
+      </w:r>
+      <w:r>
+        <w:lastRenderedPageBreak/>
+        <w:t xml:space="preserve">in time, unrolling it across many future steps creates state-management bottlenecks that your </w:t>
       </w:r>
       <w:proofErr w:type="spellStart"/>
       <w:r>
-        <w:rPr>
-          <w:lang w:val="en-PK"/>
-        </w:rPr>
         <w:t>ConvGRU</w:t>
       </w:r>
       <w:proofErr w:type="spellEnd"/>
       <w:r>
-        <w:rPr>
-          <w:lang w:val="en-PK"/>
-        </w:rPr>
         <w:t xml:space="preserve"> avoids. </w:t>
       </w:r>
+      <w:hyperlink r:id="rId18" w:history="1">
+        <w:proofErr w:type="spellStart"/>
+        <w:r>
+          <w:rPr>
+            <w:rStyle w:val="Hyperlink"/>
+          </w:rPr>
+          <w:t>CDMamba</w:t>
+        </w:r>
+        <w:proofErr w:type="spellEnd"/>
+        <w:r>
+          <w:rPr>
+            <w:rStyle w:val="Hyperlink"/>
+          </w:rPr>
+          <w:t>: Remote Sensing Image Change Detection with Mamba</w:t>
+        </w:r>
+      </w:hyperlink>
     </w:p>
     <w:p>
       <w:pPr>
@@ -908,7 +929,6 @@
           <w:bCs/>
           <w:sz w:val="28"/>
           <w:szCs w:val="28"/>
-          <w:lang w:val="en-PK"/>
         </w:rPr>
       </w:pPr>
       <w:r>
@@ -917,21 +937,12 @@
           <w:bCs/>
           <w:sz w:val="28"/>
           <w:szCs w:val="28"/>
-          <w:lang w:val="en-PK"/>
         </w:rPr>
         <w:t>IV. Peripheral Context (Broader LULC &amp; Remote Sensing Methodologies)</w:t>
       </w:r>
     </w:p>
     <w:p>
-      <w:pPr>
-        <w:rPr>
-          <w:lang w:val="en-PK"/>
-        </w:rPr>
-      </w:pPr>
-      <w:r>
-        <w:rPr>
-          <w:lang w:val="en-PK"/>
-        </w:rPr>
+      <w:r>
         <w:t>These papers can be used to contrast your deep learning approach with other regional studies and alternative machine learning methodologies.</w:t>
       </w:r>
     </w:p>
@@ -941,38 +952,33 @@
           <w:ilvl w:val="0"/>
           <w:numId w:val="4"/>
         </w:numPr>
-        <w:rPr>
-          <w:lang w:val="en-PK"/>
-        </w:rPr>
-      </w:pPr>
-      <w:r>
-        <w:rPr>
-          <w:b/>
-          <w:bCs/>
-          <w:lang w:val="en-PK"/>
+      </w:pPr>
+      <w:r>
+        <w:rPr>
+          <w:b/>
+          <w:bCs/>
         </w:rPr>
         <w:t>LULC.pdf</w:t>
       </w:r>
       <w:r>
-        <w:rPr>
-          <w:lang w:val="en-PK"/>
-        </w:rPr>
         <w:t xml:space="preserve">: This study detects LULC changes and estimates NDVI in Pakistan’s Southern Punjab province using Landsat and MODIS data. It is useful for contrasting LULC dynamics in a </w:t>
       </w:r>
       <w:proofErr w:type="spellStart"/>
       <w:r>
-        <w:rPr>
-          <w:lang w:val="en-PK"/>
-        </w:rPr>
         <w:t>neighboring</w:t>
       </w:r>
       <w:proofErr w:type="spellEnd"/>
       <w:r>
-        <w:rPr>
-          <w:lang w:val="en-PK"/>
-        </w:rPr>
         <w:t xml:space="preserve"> Pakistani province. </w:t>
       </w:r>
+      <w:hyperlink r:id="rId19" w:history="1">
+        <w:r>
+          <w:rPr>
+            <w:rStyle w:val="Hyperlink"/>
+          </w:rPr>
+          <w:t>Land Use/Land Cover Change Detection and NDVI Estimation in Pakistan’s Southern Punjab Province</w:t>
+        </w:r>
+      </w:hyperlink>
     </w:p>
     <w:p>
       <w:pPr>
@@ -980,38 +986,33 @@
           <w:ilvl w:val="0"/>
           <w:numId w:val="4"/>
         </w:numPr>
-        <w:rPr>
-          <w:lang w:val="en-PK"/>
-        </w:rPr>
-      </w:pPr>
-      <w:r>
-        <w:rPr>
-          <w:b/>
-          <w:bCs/>
-          <w:lang w:val="en-PK"/>
+      </w:pPr>
+      <w:r>
+        <w:rPr>
+          <w:b/>
+          <w:bCs/>
         </w:rPr>
         <w:t>LULC_forecasting.pdf</w:t>
       </w:r>
       <w:r>
-        <w:rPr>
-          <w:lang w:val="en-PK"/>
-        </w:rPr>
         <w:t xml:space="preserve">: This paper forecasts urban sprawl dynamics in Islamabad using an Artificial Neural Network (ANN) approach. It can be used to contrast traditional ANN </w:t>
       </w:r>
       <w:proofErr w:type="spellStart"/>
       <w:r>
-        <w:rPr>
-          <w:lang w:val="en-PK"/>
-        </w:rPr>
         <w:t>modeling</w:t>
       </w:r>
       <w:proofErr w:type="spellEnd"/>
       <w:r>
-        <w:rPr>
-          <w:lang w:val="en-PK"/>
-        </w:rPr>
         <w:t xml:space="preserve"> methodologies with your deep learning sequence models. </w:t>
       </w:r>
+      <w:hyperlink r:id="rId20" w:history="1">
+        <w:r>
+          <w:rPr>
+            <w:rStyle w:val="Hyperlink"/>
+          </w:rPr>
+          <w:t>Land Use/Land Cover Change Detection and NDVI Estimation in Pakistan’s Southern Punjab Province</w:t>
+        </w:r>
+      </w:hyperlink>
     </w:p>
     <w:p>
       <w:pPr>
@@ -1019,52 +1020,55 @@
           <w:ilvl w:val="0"/>
           <w:numId w:val="4"/>
         </w:numPr>
-        <w:rPr>
-          <w:lang w:val="en-PK"/>
-        </w:rPr>
-      </w:pPr>
-      <w:r>
-        <w:rPr>
-          <w:b/>
-          <w:bCs/>
-          <w:lang w:val="en-PK"/>
+      </w:pPr>
+      <w:r>
+        <w:rPr>
+          <w:b/>
+          <w:bCs/>
         </w:rPr>
         <w:t>land_cover_using_UNet.pdf</w:t>
       </w:r>
       <w:r>
-        <w:rPr>
-          <w:lang w:val="en-PK"/>
-        </w:rPr>
         <w:t>: This research utilizes a Transformer-based Swin-</w:t>
       </w:r>
       <w:proofErr w:type="spellStart"/>
       <w:r>
-        <w:rPr>
-          <w:lang w:val="en-PK"/>
-        </w:rPr>
         <w:t>Unet</w:t>
       </w:r>
       <w:proofErr w:type="spellEnd"/>
       <w:r>
-        <w:rPr>
-          <w:lang w:val="en-PK"/>
-        </w:rPr>
         <w:t xml:space="preserve"> architecture with </w:t>
       </w:r>
       <w:proofErr w:type="spellStart"/>
       <w:r>
-        <w:rPr>
-          <w:lang w:val="en-PK"/>
-        </w:rPr>
         <w:t>spatio</w:t>
       </w:r>
       <w:proofErr w:type="spellEnd"/>
       <w:r>
-        <w:rPr>
-          <w:lang w:val="en-PK"/>
-        </w:rPr>
         <w:t xml:space="preserve">-temporal Sentinel-1 features for land cover mapping. It provides context on the broader evolution of U-Net architectures in remote sensing. </w:t>
       </w:r>
+      <w:hyperlink r:id="rId21" w:history="1">
+        <w:r>
+          <w:rPr>
+            <w:rStyle w:val="Hyperlink"/>
+          </w:rPr>
+          <w:t xml:space="preserve">[2503.07230] A Deep Learning Architecture for Land Cover Mapping Using </w:t>
+        </w:r>
+        <w:proofErr w:type="spellStart"/>
+        <w:r>
+          <w:rPr>
+            <w:rStyle w:val="Hyperlink"/>
+          </w:rPr>
+          <w:t>Spatio</w:t>
+        </w:r>
+        <w:proofErr w:type="spellEnd"/>
+        <w:r>
+          <w:rPr>
+            <w:rStyle w:val="Hyperlink"/>
+          </w:rPr>
+          <w:t>-Temporal Sentinel-1 Features</w:t>
+        </w:r>
+      </w:hyperlink>
     </w:p>
     <w:p>
       <w:pPr>
@@ -1072,24 +1076,39 @@
           <w:ilvl w:val="0"/>
           <w:numId w:val="4"/>
         </w:numPr>
-        <w:rPr>
-          <w:lang w:val="en-PK"/>
-        </w:rPr>
-      </w:pPr>
-      <w:r>
-        <w:rPr>
-          <w:b/>
-          <w:bCs/>
-          <w:lang w:val="en-PK"/>
+      </w:pPr>
+      <w:r>
+        <w:rPr>
+          <w:b/>
+          <w:bCs/>
         </w:rPr>
         <w:t>moisture_measurement.pdf</w:t>
       </w:r>
       <w:r>
-        <w:rPr>
-          <w:lang w:val="en-PK"/>
-        </w:rPr>
         <w:t xml:space="preserve">: This study maps soil moisture using Sentinel-1 SAR data and Random Forest regression on Google Earth Engine. It provides background on alternative remote sensing variables and cloud-based methodologies. </w:t>
       </w:r>
+      <w:hyperlink r:id="rId22" w:history="1">
+        <w:r>
+          <w:rPr>
+            <w:rStyle w:val="Hyperlink"/>
+          </w:rPr>
+          <w:t xml:space="preserve">Soil Moisture Mapping Using Sentinel-1 SAR Data and Cloud-Based Regression </w:t>
+        </w:r>
+        <w:proofErr w:type="spellStart"/>
+        <w:r>
+          <w:rPr>
+            <w:rStyle w:val="Hyperlink"/>
+          </w:rPr>
+          <w:t>Modeling</w:t>
+        </w:r>
+        <w:proofErr w:type="spellEnd"/>
+        <w:r>
+          <w:rPr>
+            <w:rStyle w:val="Hyperlink"/>
+          </w:rPr>
+          <w:t xml:space="preserve"> on Google Earth Engine</w:t>
+        </w:r>
+      </w:hyperlink>
     </w:p>
     <w:p>
       <w:pPr>
@@ -1097,25 +1116,25 @@
           <w:ilvl w:val="0"/>
           <w:numId w:val="4"/>
         </w:numPr>
-        <w:rPr>
-          <w:lang w:val="en-PK"/>
-        </w:rPr>
-      </w:pPr>
-      <w:r>
-        <w:rPr>
-          <w:b/>
-          <w:bCs/>
-          <w:lang w:val="en-PK"/>
-        </w:rPr>
-        <w:lastRenderedPageBreak/>
+      </w:pPr>
+      <w:r>
+        <w:rPr>
+          <w:b/>
+          <w:bCs/>
+        </w:rPr>
         <w:t>salinity_measurement.pdf</w:t>
       </w:r>
       <w:r>
-        <w:rPr>
-          <w:lang w:val="en-PK"/>
-        </w:rPr>
         <w:t xml:space="preserve">: This paper assesses the complementarity of Sentinel-1 and Sentinel-2 data for soil salinity monitoring using Random Forest models. It offers context on multi-sensor approaches for monitoring soil degradation factors. </w:t>
       </w:r>
+      <w:hyperlink r:id="rId23" w:history="1">
+        <w:r>
+          <w:rPr>
+            <w:rStyle w:val="Hyperlink"/>
+          </w:rPr>
+          <w:t>Complementarity of Sentinel-1 and Sentinel-2 Data for Soil Salinity Monitoring to Support Sustainable Agriculture Practices in the Central Bolivian Altiplano</w:t>
+        </w:r>
+      </w:hyperlink>
     </w:p>
     <w:p/>
     <w:sectPr>
@@ -2657,6 +2676,29 @@
       <w:spacing w:val="5"/>
     </w:rPr>
   </w:style>
+  <w:style w:type="character" w:styleId="Hyperlink">
+    <w:name w:val="Hyperlink"/>
+    <w:basedOn w:val="DefaultParagraphFont"/>
+    <w:uiPriority w:val="99"/>
+    <w:unhideWhenUsed/>
+    <w:rsid w:val="002A4BB7"/>
+    <w:rPr>
+      <w:color w:val="467886" w:themeColor="hyperlink"/>
+      <w:u w:val="single"/>
+    </w:rPr>
+  </w:style>
+  <w:style w:type="character" w:styleId="UnresolvedMention">
+    <w:name w:val="Unresolved Mention"/>
+    <w:basedOn w:val="DefaultParagraphFont"/>
+    <w:uiPriority w:val="99"/>
+    <w:semiHidden/>
+    <w:unhideWhenUsed/>
+    <w:rsid w:val="002A4BB7"/>
+    <w:rPr>
+      <w:color w:val="605E5C"/>
+      <w:shd w:val="clear" w:color="auto" w:fill="E1DFDD"/>
+    </w:rPr>
+  </w:style>
 </w:styles>
 </file>
 

</xml_diff>

<commit_message>
added extended inference files and visualizations
</commit_message>
<xml_diff>
--- a/research_and_thesis_writing/research_paper_summary.docx
+++ b/research_and_thesis_writing/research_paper_summary.docx
@@ -287,6 +287,52 @@
     </w:p>
     <w:p>
       <w:pPr>
+        <w:numPr>
+          <w:ilvl w:val="0"/>
+          <w:numId w:val="1"/>
+        </w:numPr>
+      </w:pPr>
+      <w:hyperlink r:id="rId11" w:history="1">
+        <w:r>
+          <w:rPr>
+            <w:rStyle w:val="Hyperlink"/>
+          </w:rPr>
+          <w:t xml:space="preserve">Optimizing </w:t>
+        </w:r>
+        <w:proofErr w:type="spellStart"/>
+        <w:r>
+          <w:rPr>
+            <w:rStyle w:val="Hyperlink"/>
+          </w:rPr>
+          <w:t>swin</w:t>
+        </w:r>
+        <w:proofErr w:type="spellEnd"/>
+        <w:r>
+          <w:rPr>
+            <w:rStyle w:val="Hyperlink"/>
+          </w:rPr>
+          <w:t xml:space="preserve"> transformer encoder for spatiotemporal desertification classification in an arid environment</w:t>
+        </w:r>
+      </w:hyperlink>
+    </w:p>
+    <w:p>
+      <w:pPr>
+        <w:numPr>
+          <w:ilvl w:val="0"/>
+          <w:numId w:val="1"/>
+        </w:numPr>
+      </w:pPr>
+      <w:hyperlink r:id="rId12" w:history="1">
+        <w:r>
+          <w:rPr>
+            <w:rStyle w:val="Hyperlink"/>
+          </w:rPr>
+          <w:t>A Systematic Review of Desertification Identification with Multispectral LANDSAT Image and Deep Learning Models</w:t>
+        </w:r>
+      </w:hyperlink>
+    </w:p>
+    <w:p>
+      <w:pPr>
         <w:rPr>
           <w:b/>
           <w:bCs/>
@@ -349,6 +395,7 @@
           <w:b/>
           <w:bCs/>
         </w:rPr>
+        <w:lastRenderedPageBreak/>
         <w:t>Prediction_of_Ionospheric_Scintillation_with_ConvG.pdf</w:t>
       </w:r>
       <w:r>
@@ -390,21 +437,22 @@
         </m:sSub>
       </m:oMath>
       <w:r>
-        <w:t xml:space="preserve">) to manage outliers and high-noise levels in ConvGRU predictions. This perfectly supports your decision to use F.huber_loss for computing the loss on DSI deltas in your training loop. </w:t>
-      </w:r>
-      <w:hyperlink r:id="rId11" w:history="1">
-        <w:r>
-          <w:rPr>
-            <w:rStyle w:val="Hyperlink"/>
-          </w:rPr>
-          <w:t xml:space="preserve">Prediction of </w:t>
-        </w:r>
-        <w:r>
-          <w:rPr>
-            <w:rStyle w:val="Hyperlink"/>
-          </w:rPr>
-          <w:lastRenderedPageBreak/>
-          <w:t xml:space="preserve">Ionospheric Scintillation with </w:t>
+        <w:t xml:space="preserve">) to manage outliers and high-noise levels in ConvGRU predictions. This perfectly supports your decision to use </w:t>
+      </w:r>
+      <w:proofErr w:type="gramStart"/>
+      <w:r>
+        <w:t>F.huber</w:t>
+      </w:r>
+      <w:proofErr w:type="gramEnd"/>
+      <w:r>
+        <w:t xml:space="preserve">_loss for computing the loss on DSI deltas in your training loop. </w:t>
+      </w:r>
+      <w:hyperlink r:id="rId13" w:history="1">
+        <w:r>
+          <w:rPr>
+            <w:rStyle w:val="Hyperlink"/>
+          </w:rPr>
+          <w:t xml:space="preserve">Prediction of Ionospheric Scintillation with </w:t>
         </w:r>
         <w:proofErr w:type="spellStart"/>
         <w:r>
@@ -471,7 +519,7 @@
       <w:r>
         <w:t xml:space="preserve"> design. </w:t>
       </w:r>
-      <w:hyperlink r:id="rId12" w:history="1">
+      <w:hyperlink r:id="rId14" w:history="1">
         <w:r>
           <w:rPr>
             <w:rStyle w:val="Hyperlink"/>
@@ -561,7 +609,7 @@
       <w:r>
         <w:t xml:space="preserve"> framework that incorporates skip-connections to handle feature fusion across different layers. This mathematically justifies the spatial recovery mechanisms employed in your CNN Decoder. </w:t>
       </w:r>
-      <w:hyperlink r:id="rId13" w:history="1">
+      <w:hyperlink r:id="rId15" w:history="1">
         <w:proofErr w:type="spellStart"/>
         <w:r>
           <w:rPr>
@@ -624,7 +672,7 @@
       <w:r>
         <w:t xml:space="preserve">-temporal prediction of ocean elements using a Seq2Seq architecture combined with a multi-step rolling strategy. This parallels your approach of using an autoregressive decoder to unroll 12 future steps. </w:t>
       </w:r>
-      <w:hyperlink r:id="rId14" w:history="1">
+      <w:hyperlink r:id="rId16" w:history="1">
         <w:r>
           <w:rPr>
             <w:rStyle w:val="Hyperlink"/>
@@ -653,29 +701,43 @@
           <w:ilvl w:val="0"/>
           <w:numId w:val="2"/>
         </w:numPr>
+        <w:rPr>
+          <w:highlight w:val="yellow"/>
+        </w:rPr>
       </w:pPr>
       <w:r>
         <w:rPr>
           <w:b/>
           <w:bCs/>
+          <w:highlight w:val="yellow"/>
         </w:rPr>
         <w:t>Forecast_of_Ionospheric_TEC_Maps_Using_ConvGRU_Deep_Learning_Over_China.pdf</w:t>
       </w:r>
       <w:r>
+        <w:rPr>
+          <w:highlight w:val="yellow"/>
+        </w:rPr>
         <w:t xml:space="preserve">: This paper demonstrates that </w:t>
       </w:r>
       <w:proofErr w:type="spellStart"/>
       <w:r>
+        <w:rPr>
+          <w:highlight w:val="yellow"/>
+        </w:rPr>
         <w:t>ConvGRU</w:t>
       </w:r>
       <w:proofErr w:type="spellEnd"/>
       <w:r>
+        <w:rPr>
+          <w:highlight w:val="yellow"/>
+        </w:rPr>
         <w:t xml:space="preserve"> outperforms standard LSTMs when predicting 2D spatial maps over time. </w:t>
       </w:r>
-      <w:hyperlink r:id="rId15" w:history="1">
-        <w:r>
-          <w:rPr>
-            <w:rStyle w:val="Hyperlink"/>
+      <w:hyperlink r:id="rId17" w:history="1">
+        <w:r>
+          <w:rPr>
+            <w:rStyle w:val="Hyperlink"/>
+            <w:highlight w:val="yellow"/>
           </w:rPr>
           <w:t xml:space="preserve">Forecast of Ionospheric TEC Maps Using </w:t>
         </w:r>
@@ -683,6 +745,7 @@
         <w:r>
           <w:rPr>
             <w:rStyle w:val="Hyperlink"/>
+            <w:highlight w:val="yellow"/>
           </w:rPr>
           <w:t>ConvGRU</w:t>
         </w:r>
@@ -690,6 +753,7 @@
         <w:r>
           <w:rPr>
             <w:rStyle w:val="Hyperlink"/>
+            <w:highlight w:val="yellow"/>
           </w:rPr>
           <w:t xml:space="preserve"> Deep Learning Over China | IEEE Journals &amp; Magazine | IEEE Xplore</w:t>
         </w:r>
@@ -727,7 +791,7 @@
       <w:r>
         <w:t xml:space="preserve"> architecture. </w:t>
       </w:r>
-      <w:hyperlink r:id="rId16" w:history="1">
+      <w:hyperlink r:id="rId18" w:history="1">
         <w:r>
           <w:rPr>
             <w:rStyle w:val="Hyperlink"/>
@@ -766,9 +830,8 @@
           <w:sz w:val="28"/>
           <w:szCs w:val="28"/>
         </w:rPr>
-        <w:t xml:space="preserve">III. Architectural Comparison &amp; Failed </w:t>
-      </w:r>
-      <w:proofErr w:type="spellStart"/>
+        <w:t>I</w:t>
+      </w:r>
       <w:r>
         <w:rPr>
           <w:b/>
@@ -776,9 +839,8 @@
           <w:sz w:val="28"/>
           <w:szCs w:val="28"/>
         </w:rPr>
-        <w:t>ConvMamba</w:t>
-      </w:r>
-      <w:proofErr w:type="spellEnd"/>
+        <w:t>II</w:t>
+      </w:r>
       <w:r>
         <w:rPr>
           <w:b/>
@@ -786,159 +848,7 @@
           <w:sz w:val="28"/>
           <w:szCs w:val="28"/>
         </w:rPr>
-        <w:t xml:space="preserve"> Justification</w:t>
-      </w:r>
-    </w:p>
-    <w:p>
-      <w:r>
-        <w:t xml:space="preserve">These papers are highly valuable for a "Model Selection and Iteration" section, allowing you to rigorously justify why </w:t>
-      </w:r>
-      <w:proofErr w:type="spellStart"/>
-      <w:r>
-        <w:t>ConvGRU</w:t>
-      </w:r>
-      <w:proofErr w:type="spellEnd"/>
-      <w:r>
-        <w:t xml:space="preserve"> succeeded where your </w:t>
-      </w:r>
-      <w:proofErr w:type="spellStart"/>
-      <w:r>
-        <w:t>ConvMamba</w:t>
-      </w:r>
-      <w:proofErr w:type="spellEnd"/>
-      <w:r>
-        <w:t xml:space="preserve"> implementation failed.</w:t>
-      </w:r>
-    </w:p>
-    <w:p>
-      <w:pPr>
-        <w:numPr>
-          <w:ilvl w:val="0"/>
-          <w:numId w:val="3"/>
-        </w:numPr>
-      </w:pPr>
-      <w:r>
-        <w:rPr>
-          <w:b/>
-          <w:bCs/>
-        </w:rPr>
-        <w:t>remotesensing-18-00243-v2.pdf</w:t>
-      </w:r>
-      <w:r>
-        <w:t xml:space="preserve">: This comprehensive survey of Mamba in remote sensing highlights the "Topological Mismatch Between 1D Priors and 2D EO Data". It explains that flattening 2D spatial grids into 1D sequences for State Space Models (SSMs) distorts </w:t>
-      </w:r>
-      <w:proofErr w:type="spellStart"/>
-      <w:r>
-        <w:t>neighborhood</w:t>
-      </w:r>
-      <w:proofErr w:type="spellEnd"/>
-      <w:r>
-        <w:t xml:space="preserve"> relations and complicates state updates. You can use this to explain why managing these 1D states across complex 2D spatial features caused memory and state retention issues in your </w:t>
-      </w:r>
-      <w:proofErr w:type="spellStart"/>
-      <w:r>
-        <w:t>ConvMamba</w:t>
-      </w:r>
-      <w:proofErr w:type="spellEnd"/>
-      <w:r>
-        <w:t xml:space="preserve"> attempt, making the explicit spatial gating of </w:t>
-      </w:r>
-      <w:proofErr w:type="spellStart"/>
-      <w:r>
-        <w:t>ConvGRU</w:t>
-      </w:r>
-      <w:proofErr w:type="spellEnd"/>
-      <w:r>
-        <w:t xml:space="preserve"> a more stable choice. </w:t>
-      </w:r>
-      <w:hyperlink r:id="rId17" w:history="1">
-        <w:r>
-          <w:rPr>
-            <w:rStyle w:val="Hyperlink"/>
-          </w:rPr>
-          <w:t>Mamba for Remote Sensing: Architectures, Hybrid Paradigms, and Future Directions</w:t>
-        </w:r>
-      </w:hyperlink>
-    </w:p>
-    <w:p>
-      <w:pPr>
-        <w:numPr>
-          <w:ilvl w:val="0"/>
-          <w:numId w:val="3"/>
-        </w:numPr>
-      </w:pPr>
-      <w:r>
-        <w:rPr>
-          <w:b/>
-          <w:bCs/>
-        </w:rPr>
-        <w:t>2406.04207v2.pdf</w:t>
-      </w:r>
-      <w:r>
-        <w:t>: This paper introduces "</w:t>
-      </w:r>
-      <w:proofErr w:type="spellStart"/>
-      <w:r>
-        <w:t>CDMamba</w:t>
-      </w:r>
-      <w:proofErr w:type="spellEnd"/>
-      <w:r>
-        <w:t xml:space="preserve">" to successfully perform remote sensing image change detection. You can contrast their bi-temporal (two-image) change detection task with your continuous 12-step autoregressive forecasting task. This contrast demonstrates that while </w:t>
-      </w:r>
-      <w:proofErr w:type="spellStart"/>
-      <w:r>
-        <w:t>ConvMamba</w:t>
-      </w:r>
-      <w:proofErr w:type="spellEnd"/>
-      <w:r>
-        <w:t xml:space="preserve"> can work for comparing two static points </w:t>
-      </w:r>
-      <w:r>
-        <w:lastRenderedPageBreak/>
-        <w:t xml:space="preserve">in time, unrolling it across many future steps creates state-management bottlenecks that your </w:t>
-      </w:r>
-      <w:proofErr w:type="spellStart"/>
-      <w:r>
-        <w:t>ConvGRU</w:t>
-      </w:r>
-      <w:proofErr w:type="spellEnd"/>
-      <w:r>
-        <w:t xml:space="preserve"> avoids. </w:t>
-      </w:r>
-      <w:hyperlink r:id="rId18" w:history="1">
-        <w:proofErr w:type="spellStart"/>
-        <w:r>
-          <w:rPr>
-            <w:rStyle w:val="Hyperlink"/>
-          </w:rPr>
-          <w:t>CDMamba</w:t>
-        </w:r>
-        <w:proofErr w:type="spellEnd"/>
-        <w:r>
-          <w:rPr>
-            <w:rStyle w:val="Hyperlink"/>
-          </w:rPr>
-          <w:t>: Remote Sensing Image Change Detection with Mamba</w:t>
-        </w:r>
-      </w:hyperlink>
-    </w:p>
-    <w:p>
-      <w:pPr>
-        <w:rPr>
-          <w:b/>
-          <w:bCs/>
-          <w:sz w:val="28"/>
-          <w:szCs w:val="28"/>
-        </w:rPr>
-      </w:pPr>
-      <w:r>
-        <w:rPr>
-          <w:b/>
-          <w:bCs/>
-          <w:sz w:val="28"/>
-          <w:szCs w:val="28"/>
-        </w:rPr>
-        <w:t>IV. Peripheral Context (Broader LULC &amp; Remote Sensing Methodologies)</w:t>
+        <w:t>. Peripheral Context (Broader LULC &amp; Remote Sensing Methodologies)</w:t>
       </w:r>
     </w:p>
     <w:p>
@@ -952,24 +862,43 @@
           <w:ilvl w:val="0"/>
           <w:numId w:val="4"/>
         </w:numPr>
+        <w:rPr>
+          <w:highlight w:val="yellow"/>
+        </w:rPr>
       </w:pPr>
       <w:r>
         <w:rPr>
           <w:b/>
           <w:bCs/>
+          <w:highlight w:val="yellow"/>
         </w:rPr>
         <w:t>LULC.pdf</w:t>
       </w:r>
       <w:r>
+        <w:rPr>
+          <w:highlight w:val="yellow"/>
+        </w:rPr>
         <w:t xml:space="preserve">: This study detects LULC changes and estimates NDVI in Pakistan’s Southern Punjab province using Landsat and MODIS data. It is useful for contrasting LULC dynamics in a </w:t>
       </w:r>
       <w:proofErr w:type="spellStart"/>
       <w:r>
+        <w:rPr>
+          <w:highlight w:val="yellow"/>
+        </w:rPr>
         <w:t>neighboring</w:t>
       </w:r>
       <w:proofErr w:type="spellEnd"/>
       <w:r>
-        <w:t xml:space="preserve"> Pakistani province. </w:t>
+        <w:rPr>
+          <w:highlight w:val="yellow"/>
+        </w:rPr>
+        <w:t xml:space="preserve"> Pakistani province</w:t>
+      </w:r>
+      <w:r>
+        <w:rPr>
+          <w:highlight w:val="yellow"/>
+        </w:rPr>
+        <w:t xml:space="preserve"> </w:t>
       </w:r>
       <w:hyperlink r:id="rId19" w:history="1">
         <w:r>
@@ -986,6 +915,9 @@
           <w:ilvl w:val="0"/>
           <w:numId w:val="4"/>
         </w:numPr>
+        <w:rPr>
+          <w:highlight w:val="yellow"/>
+        </w:rPr>
       </w:pPr>
       <w:r>
         <w:rPr>
@@ -999,20 +931,33 @@
       </w:r>
       <w:proofErr w:type="spellStart"/>
       <w:r>
+        <w:lastRenderedPageBreak/>
         <w:t>modeling</w:t>
       </w:r>
       <w:proofErr w:type="spellEnd"/>
       <w:r>
-        <w:t xml:space="preserve"> methodologies with your deep learning sequence models. </w:t>
+        <w:t xml:space="preserve"> methodologies with your deep learning sequence models.</w:t>
+      </w:r>
+      <w:r>
+        <w:rPr>
+          <w:highlight w:val="yellow"/>
+        </w:rPr>
+        <w:t xml:space="preserve"> </w:t>
       </w:r>
       <w:hyperlink r:id="rId20" w:history="1">
         <w:r>
           <w:rPr>
             <w:rStyle w:val="Hyperlink"/>
-          </w:rPr>
-          <w:t>Land Use/Land Cover Change Detection and NDVI Estimation in Pakistan’s Southern Punjab Province</w:t>
+            <w:highlight w:val="yellow"/>
+          </w:rPr>
+          <w:t>Forecasting Urban Sprawl Dynamics in Islamabad: A Neural Network Approach</w:t>
         </w:r>
       </w:hyperlink>
+    </w:p>
+    <w:p>
+      <w:pPr>
+        <w:ind w:left="720"/>
+      </w:pPr>
     </w:p>
     <w:p>
       <w:pPr>
@@ -1135,6 +1080,222 @@
           <w:t>Complementarity of Sentinel-1 and Sentinel-2 Data for Soil Salinity Monitoring to Support Sustainable Agriculture Practices in the Central Bolivian Altiplano</w:t>
         </w:r>
       </w:hyperlink>
+    </w:p>
+    <w:p>
+      <w:pPr>
+        <w:pStyle w:val="ListParagraph"/>
+        <w:numPr>
+          <w:ilvl w:val="0"/>
+          <w:numId w:val="4"/>
+        </w:numPr>
+        <w:spacing w:after="80" w:line="240" w:lineRule="auto"/>
+        <w:rPr>
+          <w:rFonts w:ascii="Times New Roman" w:eastAsia="Times New Roman" w:hAnsi="Times New Roman" w:cs="Times New Roman"/>
+          <w:kern w:val="0"/>
+          <w:sz w:val="15"/>
+          <w:szCs w:val="15"/>
+          <w:lang w:eastAsia="en-PK"/>
+          <w14:ligatures w14:val="none"/>
+        </w:rPr>
+      </w:pPr>
+      <w:r>
+        <w:rPr>
+          <w:rFonts w:ascii="Times New Roman" w:eastAsia="Times New Roman" w:hAnsi="Times New Roman" w:cs="Times New Roman"/>
+          <w:kern w:val="0"/>
+          <w:sz w:val="15"/>
+          <w:szCs w:val="15"/>
+          <w:highlight w:val="yellow"/>
+          <w:lang w:eastAsia="en-PK"/>
+          <w14:ligatures w14:val="none"/>
+        </w:rPr>
+        <w:t xml:space="preserve">[9] K. </w:t>
+      </w:r>
+      <w:proofErr w:type="spellStart"/>
+      <w:r>
+        <w:rPr>
+          <w:rFonts w:ascii="Times New Roman" w:eastAsia="Times New Roman" w:hAnsi="Times New Roman" w:cs="Times New Roman"/>
+          <w:kern w:val="0"/>
+          <w:sz w:val="15"/>
+          <w:szCs w:val="15"/>
+          <w:highlight w:val="yellow"/>
+          <w:lang w:eastAsia="en-PK"/>
+          <w14:ligatures w14:val="none"/>
+        </w:rPr>
+        <w:t>Panhwar</w:t>
+      </w:r>
+      <w:proofErr w:type="spellEnd"/>
+      <w:r>
+        <w:rPr>
+          <w:rFonts w:ascii="Times New Roman" w:eastAsia="Times New Roman" w:hAnsi="Times New Roman" w:cs="Times New Roman"/>
+          <w:kern w:val="0"/>
+          <w:sz w:val="15"/>
+          <w:szCs w:val="15"/>
+          <w:highlight w:val="yellow"/>
+          <w:lang w:eastAsia="en-PK"/>
+          <w14:ligatures w14:val="none"/>
+        </w:rPr>
+        <w:t>, B. Naz, and S. Bhatti, “A Systematic Review of Desertification Identification with Multispectral LANDSAT Image and Deep Learning Models,” International Journal of Innovations in Science &amp; Technology, vol. 6, no. 1, pp. 143–169, Feb. 2024.</w:t>
+      </w:r>
+    </w:p>
+    <w:p>
+      <w:pPr>
+        <w:pStyle w:val="ListParagraph"/>
+        <w:numPr>
+          <w:ilvl w:val="0"/>
+          <w:numId w:val="4"/>
+        </w:numPr>
+        <w:spacing w:after="80" w:line="240" w:lineRule="auto"/>
+        <w:rPr>
+          <w:rFonts w:ascii="Times New Roman" w:eastAsia="Times New Roman" w:hAnsi="Times New Roman" w:cs="Times New Roman"/>
+          <w:kern w:val="0"/>
+          <w:sz w:val="15"/>
+          <w:szCs w:val="15"/>
+          <w:lang w:eastAsia="en-PK"/>
+          <w14:ligatures w14:val="none"/>
+        </w:rPr>
+      </w:pPr>
+      <w:r>
+        <w:rPr>
+          <w:rFonts w:ascii="Times New Roman" w:eastAsia="Times New Roman" w:hAnsi="Times New Roman" w:cs="Times New Roman"/>
+          <w:kern w:val="0"/>
+          <w:sz w:val="15"/>
+          <w:szCs w:val="15"/>
+          <w:highlight w:val="yellow"/>
+          <w:lang w:eastAsia="en-PK"/>
+          <w14:ligatures w14:val="none"/>
+        </w:rPr>
+        <w:t xml:space="preserve">[10] K. </w:t>
+      </w:r>
+      <w:proofErr w:type="spellStart"/>
+      <w:r>
+        <w:rPr>
+          <w:rFonts w:ascii="Times New Roman" w:eastAsia="Times New Roman" w:hAnsi="Times New Roman" w:cs="Times New Roman"/>
+          <w:kern w:val="0"/>
+          <w:sz w:val="15"/>
+          <w:szCs w:val="15"/>
+          <w:highlight w:val="yellow"/>
+          <w:lang w:eastAsia="en-PK"/>
+          <w14:ligatures w14:val="none"/>
+        </w:rPr>
+        <w:t>Panhwar</w:t>
+      </w:r>
+      <w:proofErr w:type="spellEnd"/>
+      <w:r>
+        <w:rPr>
+          <w:rFonts w:ascii="Times New Roman" w:eastAsia="Times New Roman" w:hAnsi="Times New Roman" w:cs="Times New Roman"/>
+          <w:kern w:val="0"/>
+          <w:sz w:val="15"/>
+          <w:szCs w:val="15"/>
+          <w:highlight w:val="yellow"/>
+          <w:lang w:eastAsia="en-PK"/>
+          <w14:ligatures w14:val="none"/>
+        </w:rPr>
+        <w:t xml:space="preserve">, B. Naz, S. Bhatti, A. Shaikh, and A. </w:t>
+      </w:r>
+      <w:proofErr w:type="spellStart"/>
+      <w:r>
+        <w:rPr>
+          <w:rFonts w:ascii="Times New Roman" w:eastAsia="Times New Roman" w:hAnsi="Times New Roman" w:cs="Times New Roman"/>
+          <w:kern w:val="0"/>
+          <w:sz w:val="15"/>
+          <w:szCs w:val="15"/>
+          <w:highlight w:val="yellow"/>
+          <w:lang w:eastAsia="en-PK"/>
+          <w14:ligatures w14:val="none"/>
+        </w:rPr>
+        <w:t>Alqazzaz</w:t>
+      </w:r>
+      <w:proofErr w:type="spellEnd"/>
+      <w:r>
+        <w:rPr>
+          <w:rFonts w:ascii="Times New Roman" w:eastAsia="Times New Roman" w:hAnsi="Times New Roman" w:cs="Times New Roman"/>
+          <w:kern w:val="0"/>
+          <w:sz w:val="15"/>
+          <w:szCs w:val="15"/>
+          <w:highlight w:val="yellow"/>
+          <w:lang w:eastAsia="en-PK"/>
+          <w14:ligatures w14:val="none"/>
+        </w:rPr>
+        <w:t xml:space="preserve">, “Optimizing </w:t>
+      </w:r>
+      <w:proofErr w:type="spellStart"/>
+      <w:r>
+        <w:rPr>
+          <w:rFonts w:ascii="Times New Roman" w:eastAsia="Times New Roman" w:hAnsi="Times New Roman" w:cs="Times New Roman"/>
+          <w:kern w:val="0"/>
+          <w:sz w:val="15"/>
+          <w:szCs w:val="15"/>
+          <w:highlight w:val="yellow"/>
+          <w:lang w:eastAsia="en-PK"/>
+          <w14:ligatures w14:val="none"/>
+        </w:rPr>
+        <w:t>swin</w:t>
+      </w:r>
+      <w:proofErr w:type="spellEnd"/>
+      <w:r>
+        <w:rPr>
+          <w:rFonts w:ascii="Times New Roman" w:eastAsia="Times New Roman" w:hAnsi="Times New Roman" w:cs="Times New Roman"/>
+          <w:kern w:val="0"/>
+          <w:sz w:val="15"/>
+          <w:szCs w:val="15"/>
+          <w:highlight w:val="yellow"/>
+          <w:lang w:eastAsia="en-PK"/>
+          <w14:ligatures w14:val="none"/>
+        </w:rPr>
+        <w:t xml:space="preserve"> transformer encoder for spatiotemporal desertification classification in an arid environment,” </w:t>
+      </w:r>
+      <w:proofErr w:type="spellStart"/>
+      <w:r>
+        <w:rPr>
+          <w:rFonts w:ascii="Times New Roman" w:eastAsia="Times New Roman" w:hAnsi="Times New Roman" w:cs="Times New Roman"/>
+          <w:kern w:val="0"/>
+          <w:sz w:val="15"/>
+          <w:szCs w:val="15"/>
+          <w:highlight w:val="yellow"/>
+          <w:lang w:eastAsia="en-PK"/>
+          <w14:ligatures w14:val="none"/>
+        </w:rPr>
+        <w:t>PeerJ</w:t>
+      </w:r>
+      <w:proofErr w:type="spellEnd"/>
+      <w:r>
+        <w:rPr>
+          <w:rFonts w:ascii="Times New Roman" w:eastAsia="Times New Roman" w:hAnsi="Times New Roman" w:cs="Times New Roman"/>
+          <w:kern w:val="0"/>
+          <w:sz w:val="15"/>
+          <w:szCs w:val="15"/>
+          <w:highlight w:val="yellow"/>
+          <w:lang w:eastAsia="en-PK"/>
+          <w14:ligatures w14:val="none"/>
+        </w:rPr>
+        <w:t xml:space="preserve"> Computer Science, vol. 12, Art. no. e3788, 2026, </w:t>
+      </w:r>
+      <w:proofErr w:type="spellStart"/>
+      <w:r>
+        <w:rPr>
+          <w:rFonts w:ascii="Times New Roman" w:eastAsia="Times New Roman" w:hAnsi="Times New Roman" w:cs="Times New Roman"/>
+          <w:kern w:val="0"/>
+          <w:sz w:val="15"/>
+          <w:szCs w:val="15"/>
+          <w:highlight w:val="yellow"/>
+          <w:lang w:eastAsia="en-PK"/>
+          <w14:ligatures w14:val="none"/>
+        </w:rPr>
+        <w:t>doi</w:t>
+      </w:r>
+      <w:proofErr w:type="spellEnd"/>
+      <w:r>
+        <w:rPr>
+          <w:rFonts w:ascii="Times New Roman" w:eastAsia="Times New Roman" w:hAnsi="Times New Roman" w:cs="Times New Roman"/>
+          <w:kern w:val="0"/>
+          <w:sz w:val="15"/>
+          <w:szCs w:val="15"/>
+          <w:highlight w:val="yellow"/>
+          <w:lang w:eastAsia="en-PK"/>
+          <w14:ligatures w14:val="none"/>
+        </w:rPr>
+        <w:t>: 10.7717/peerj-cs.3788.</w:t>
+      </w:r>
     </w:p>
     <w:p/>
     <w:sectPr>
@@ -2363,6 +2524,7 @@
   <w:style w:type="character" w:default="1" w:styleId="DefaultParagraphFont">
     <w:name w:val="Default Paragraph Font"/>
     <w:uiPriority w:val="1"/>
+    <w:semiHidden/>
     <w:unhideWhenUsed/>
   </w:style>
   <w:style w:type="table" w:default="1" w:styleId="TableNormal">
@@ -2697,6 +2859,18 @@
     <w:rPr>
       <w:color w:val="605E5C"/>
       <w:shd w:val="clear" w:color="auto" w:fill="E1DFDD"/>
+    </w:rPr>
+  </w:style>
+  <w:style w:type="character" w:styleId="FollowedHyperlink">
+    <w:name w:val="FollowedHyperlink"/>
+    <w:basedOn w:val="DefaultParagraphFont"/>
+    <w:uiPriority w:val="99"/>
+    <w:semiHidden/>
+    <w:unhideWhenUsed/>
+    <w:rsid w:val="00885D97"/>
+    <w:rPr>
+      <w:color w:val="96607D" w:themeColor="followedHyperlink"/>
+      <w:u w:val="single"/>
     </w:rPr>
   </w:style>
 </w:styles>

</xml_diff>